<commit_message>
Kometartiklen: præciseret at rho er afstanden fra observatøren til kometen
Co-Authored-By: Claude Opus 5.5 <noreply@anthropic.com>
Claude-Session: https://claude.ai/code/session_013wZZbcd8JLzDSkyusgC2RL
</commit_message>
<xml_diff>
--- a/kometbaner-lille-teleskop.docx
+++ b/kometbaner-lille-teleskop.docx
@@ -3274,7 +3274,23 @@
         <w:t xml:space="preserve"> </w:t>
       </w:r>
       <w:r>
-        <w:t xml:space="preserve">er den ukendte geocentriske afstand.</w:t>
+        <w:t xml:space="preserve">er den ukendte afstand fra observatøren til kometen — på figur 3 den stiplede sigtelinje fra Jorden. Den kaldes ofte den</w:t>
+      </w:r>
+      <w:r>
+        <w:t xml:space="preserve"> </w:t>
+      </w:r>
+      <w:r>
+        <w:rPr>
+          <w:iCs/>
+          <w:i/>
+        </w:rPr>
+        <w:t xml:space="preserve">geocentriske</w:t>
+      </w:r>
+      <w:r>
+        <w:t xml:space="preserve"> </w:t>
+      </w:r>
+      <w:r>
+        <w:t xml:space="preserve">afstand, dvs. afstanden set fra Jorden; strengt taget regnes den fra observatøren, men forskellen er højst én jordradius ud af ca. 28 000.</w:t>
       </w:r>
       <w:r>
         <w:t xml:space="preserve"> </w:t>
@@ -3291,7 +3307,7 @@
         <w:t xml:space="preserve"> </w:t>
       </w:r>
       <w:r>
-        <w:t xml:space="preserve">kendes fra Jordens bane,</w:t>
+        <w:t xml:space="preserve">kendes fra Jordens bane og observatørens plads på jordkloden (punkt 2 ovenfor),</w:t>
       </w:r>
       <w:r>
         <w:t xml:space="preserve"> </w:t>
@@ -5912,7 +5928,7 @@
         <w:pStyle w:val="BodyText"/>
       </w:pPr>
       <w:r>
-        <w:t xml:space="preserve">Beregningen lod jeg en AI-sprogmodel udføre efter Gauss’ opskrift. Den gav en geocentrisk afstand</w:t>
+        <w:t xml:space="preserve">Beregningen lod jeg en AI-sprogmodel udføre efter Gauss’ opskrift. Den gav en afstand fra Jorden til kometen på</w:t>
       </w:r>
       <w:r>
         <w:t xml:space="preserve"> </w:t>

</xml_diff>